<commit_message>
auto backup Thu 14 May 21:56:09 CST 2026
</commit_message>
<xml_diff>
--- a/陈道祥_简历.docx
+++ b/陈道祥_简历.docx
@@ -2,107 +2,186 @@
 <file path=word/document.xml><?xml version="1.0" encoding="utf-8"?>
 <w:document xmlns:wpc="http://schemas.microsoft.com/office/word/2010/wordprocessingCanvas" xmlns:mo="http://schemas.microsoft.com/office/mac/office/2008/main" xmlns:mc="http://schemas.openxmlformats.org/markup-compatibility/2006" xmlns:mv="urn:schemas-microsoft-com:mac:vml" xmlns:o="urn:schemas-microsoft-com:office:office" xmlns:r="http://schemas.openxmlformats.org/officeDocument/2006/relationships" xmlns:m="http://schemas.openxmlformats.org/officeDocument/2006/math" xmlns:v="urn:schemas-microsoft-com:vml" xmlns:wp14="http://schemas.microsoft.com/office/word/2010/wordprocessingDrawing" xmlns:wp="http://schemas.openxmlformats.org/drawingml/2006/wordprocessingDrawing" xmlns:w10="urn:schemas-microsoft-com:office:word" xmlns:w="http://schemas.openxmlformats.org/wordprocessingml/2006/main" xmlns:w14="http://schemas.microsoft.com/office/word/2010/wordml" xmlns:wpg="http://schemas.microsoft.com/office/word/2010/wordprocessingGroup" xmlns:wpi="http://schemas.microsoft.com/office/word/2010/wordprocessingInk" xmlns:wne="http://schemas.microsoft.com/office/word/2006/wordml" xmlns:wps="http://schemas.microsoft.com/office/word/2010/wordprocessingShape" mc:Ignorable="w14 wp14">
   <w:body>
+    <w:tbl>
+      <w:tblPr>
+        <w:tblW w:type="auto" w:w="0"/>
+        <w:jc w:val="left"/>
+        <w:tblLook w:firstColumn="1" w:firstRow="1" w:lastColumn="0" w:lastRow="0" w:noHBand="0" w:noVBand="1" w:val="04A0"/>
+      </w:tblPr>
+      <w:tblGrid>
+        <w:gridCol w:w="5100"/>
+        <w:gridCol w:w="5100"/>
+      </w:tblGrid>
+      <w:tr>
+        <w:tc>
+          <w:tcPr>
+            <w:tcW w:type="dxa" w:w="5100"/>
+            <w:tcBorders>
+              <w:top w:val="none" w:sz="0" w:space="0" w:color="auto"/>
+              <w:left w:val="none" w:sz="0" w:space="0" w:color="auto"/>
+              <w:bottom w:val="none" w:sz="0" w:space="0" w:color="auto"/>
+              <w:right w:val="none" w:sz="0" w:space="0" w:color="auto"/>
+            </w:tcBorders>
+          </w:tcPr>
+          <w:p>
+            <w:pPr>
+              <w:spacing w:before="0" w:after="0"/>
+              <w:jc w:val="left"/>
+            </w:pPr>
+            <w:r>
+              <w:rPr>
+                <w:rFonts w:ascii="微软雅黑" w:hAnsi="微软雅黑" w:eastAsia="微软雅黑"/>
+                <w:b/>
+                <w:color w:val="333333"/>
+                <w:sz w:val="40"/>
+              </w:rPr>
+              <w:t>陈道祥</w:t>
+            </w:r>
+          </w:p>
+          <w:p>
+            <w:pPr>
+              <w:spacing w:before="0" w:after="0" w:line="240" w:lineRule="auto"/>
+            </w:pPr>
+            <w:r>
+              <w:rPr>
+                <w:rFonts w:ascii="微软雅黑" w:hAnsi="微软雅黑" w:eastAsia="微软雅黑"/>
+                <w:b w:val="0"/>
+                <w:color w:val="888888"/>
+                <w:sz w:val="16"/>
+              </w:rPr>
+              <w:t>1429443912@qq.com</w:t>
+            </w:r>
+          </w:p>
+          <w:p>
+            <w:pPr>
+              <w:spacing w:before="0" w:after="0" w:line="240" w:lineRule="auto"/>
+            </w:pPr>
+            <w:r>
+              <w:rPr>
+                <w:rFonts w:ascii="微软雅黑" w:hAnsi="微软雅黑" w:eastAsia="微软雅黑"/>
+                <w:b w:val="0"/>
+                <w:color w:val="333333"/>
+                <w:sz w:val="16"/>
+              </w:rPr>
+              <w:t>github.com/afd-ll</w:t>
+            </w:r>
+          </w:p>
+          <w:p>
+            <w:pPr>
+              <w:spacing w:before="0" w:after="0" w:line="240" w:lineRule="auto"/>
+            </w:pPr>
+            <w:r>
+              <w:rPr>
+                <w:rFonts w:ascii="微软雅黑" w:hAnsi="微软雅黑" w:eastAsia="微软雅黑"/>
+                <w:b w:val="0"/>
+                <w:color w:val="333333"/>
+                <w:sz w:val="16"/>
+              </w:rPr>
+              <w:t>嵌入式软件开发 / C/C++</w:t>
+            </w:r>
+          </w:p>
+        </w:tc>
+        <w:tc>
+          <w:tcPr>
+            <w:tcW w:type="dxa" w:w="5100"/>
+            <w:tcBorders>
+              <w:top w:val="none" w:sz="0" w:space="0" w:color="auto"/>
+              <w:left w:val="none" w:sz="0" w:space="0" w:color="auto"/>
+              <w:bottom w:val="none" w:sz="0" w:space="0" w:color="auto"/>
+              <w:right w:val="none" w:sz="0" w:space="0" w:color="auto"/>
+            </w:tcBorders>
+          </w:tcPr>
+          <w:p>
+            <w:pPr>
+              <w:spacing w:before="40" w:after="0"/>
+              <w:jc w:val="center"/>
+            </w:pPr>
+            <w:r>
+              <w:drawing>
+                <wp:inline xmlns:a="http://schemas.openxmlformats.org/drawingml/2006/main" xmlns:pic="http://schemas.openxmlformats.org/drawingml/2006/picture">
+                  <wp:extent cx="777240" cy="1088136"/>
+                  <wp:docPr id="1" name="Picture 1"/>
+                  <wp:cNvGraphicFramePr>
+                    <a:graphicFrameLocks noChangeAspect="1"/>
+                  </wp:cNvGraphicFramePr>
+                  <a:graphic>
+                    <a:graphicData uri="http://schemas.openxmlformats.org/drawingml/2006/picture">
+                      <pic:pic>
+                        <pic:nvPicPr>
+                          <pic:cNvPr id="0" name="老大证件照.jpg"/>
+                          <pic:cNvPicPr/>
+                        </pic:nvPicPr>
+                        <pic:blipFill>
+                          <a:blip r:embed="rId9"/>
+                          <a:stretch>
+                            <a:fillRect/>
+                          </a:stretch>
+                        </pic:blipFill>
+                        <pic:spPr>
+                          <a:xfrm>
+                            <a:off x="0" y="0"/>
+                            <a:ext cx="777240" cy="1088136"/>
+                          </a:xfrm>
+                          <a:prstGeom prst="rect"/>
+                        </pic:spPr>
+                      </pic:pic>
+                    </a:graphicData>
+                  </a:graphic>
+                </wp:inline>
+              </w:drawing>
+            </w:r>
+          </w:p>
+          <w:p>
+            <w:pPr>
+              <w:spacing w:before="0" w:after="0"/>
+            </w:pPr>
+          </w:p>
+          <w:p>
+            <w:pPr>
+              <w:spacing w:before="0" w:after="0"/>
+            </w:pPr>
+          </w:p>
+        </w:tc>
+      </w:tr>
+    </w:tbl>
     <w:p>
       <w:pPr>
-        <w:spacing w:before="200" w:after="40"/>
-        <w:jc w:val="center"/>
+        <w:spacing w:before="0" w:after="20" w:line="24" w:lineRule="auto"/>
+      </w:pPr>
+      <w:r>
+        <w:rPr>
+          <w:rFonts w:ascii="微软雅黑" w:hAnsi="微软雅黑" w:eastAsia="微软雅黑"/>
+          <w:b w:val="0"/>
+          <w:color w:val="2B527A"/>
+          <w:sz w:val="6"/>
+        </w:rPr>
+        <w:t>───────────────────────────────────────────────────────</w:t>
+      </w:r>
+    </w:p>
+    <w:p>
+      <w:pPr>
+        <w:spacing w:before="80" w:after="0" w:line="192" w:lineRule="auto"/>
+      </w:pPr>
+      <w:r>
+        <w:rPr>
+          <w:rFonts w:ascii="微软雅黑" w:hAnsi="微软雅黑" w:eastAsia="微软雅黑"/>
+          <w:b/>
+          <w:color w:val="2B527A"/>
+          <w:sz w:val="20"/>
+        </w:rPr>
+        <w:t>教育背景</w:t>
+      </w:r>
+    </w:p>
+    <w:p>
+      <w:pPr>
+        <w:spacing w:before="20" w:after="0" w:line="264" w:lineRule="auto"/>
       </w:pPr>
       <w:r>
         <w:rPr>
           <w:rFonts w:ascii="微软雅黑" w:hAnsi="微软雅黑" w:eastAsia="微软雅黑"/>
           <w:b/>
           <w:color w:val="333333"/>
-          <w:sz w:val="52"/>
-        </w:rPr>
-        <w:t>陈道祥</w:t>
-      </w:r>
-    </w:p>
-    <w:p>
-      <w:pPr>
-        <w:spacing w:before="0" w:after="40"/>
-        <w:jc w:val="center"/>
-      </w:pPr>
-      <w:r>
-        <w:rPr>
-          <w:rFonts w:ascii="微软雅黑" w:hAnsi="微软雅黑" w:eastAsia="微软雅黑"/>
-          <w:b w:val="0"/>
-          <w:color w:val="888888"/>
-          <w:sz w:val="19"/>
-        </w:rPr>
-        <w:t>1429443912@qq.com</w:t>
-      </w:r>
-      <w:r>
-        <w:rPr>
-          <w:rFonts w:ascii="微软雅黑" w:hAnsi="微软雅黑" w:eastAsia="微软雅黑"/>
-          <w:b w:val="0"/>
-          <w:color w:val="888888"/>
-          <w:sz w:val="19"/>
-        </w:rPr>
-        <w:t xml:space="preserve">  ·  </w:t>
-      </w:r>
-      <w:r>
-        <w:rPr>
-          <w:rFonts w:ascii="微软雅黑" w:hAnsi="微软雅黑" w:eastAsia="微软雅黑"/>
-          <w:b w:val="0"/>
-          <w:color w:val="888888"/>
-          <w:sz w:val="19"/>
-        </w:rPr>
-        <w:t>github.com/afd-ll</w:t>
-      </w:r>
-    </w:p>
-    <w:p>
-      <w:pPr>
-        <w:spacing w:before="0" w:after="80"/>
-        <w:jc w:val="center"/>
-      </w:pPr>
-      <w:r>
-        <w:rPr>
-          <w:rFonts w:ascii="微软雅黑" w:hAnsi="微软雅黑" w:eastAsia="微软雅黑"/>
-          <w:b/>
-          <w:color w:val="333333"/>
-          <w:sz w:val="19"/>
-        </w:rPr>
-        <w:t>求职意向：嵌入式软件开发 / C/C++ 开发工程师</w:t>
-      </w:r>
-    </w:p>
-    <w:p>
-      <w:pPr>
-        <w:spacing w:before="200" w:after="0"/>
-      </w:pPr>
-      <w:r>
-        <w:rPr>
-          <w:rFonts w:ascii="微软雅黑" w:hAnsi="微软雅黑" w:eastAsia="微软雅黑"/>
-          <w:b/>
-          <w:color w:val="2B527A"/>
-          <w:sz w:val="22"/>
-        </w:rPr>
-        <w:t>教育背景</w:t>
-      </w:r>
-    </w:p>
-    <w:p>
-      <w:pPr>
-        <w:spacing w:before="20" w:after="80" w:line="48" w:lineRule="auto"/>
-      </w:pPr>
-      <w:r>
-        <w:rPr>
-          <w:rFonts w:ascii="微软雅黑" w:hAnsi="微软雅黑" w:eastAsia="微软雅黑"/>
-          <w:b w:val="0"/>
-          <w:color w:val="2B527A"/>
-          <w:sz w:val="10"/>
-        </w:rPr>
-        <w:t>──────────────────────────────────────────────────</w:t>
-      </w:r>
-    </w:p>
-    <w:p>
-      <w:pPr>
-        <w:spacing w:before="40" w:after="0" w:line="312" w:lineRule="auto"/>
-      </w:pPr>
-      <w:r>
-        <w:rPr>
-          <w:rFonts w:ascii="微软雅黑" w:hAnsi="微软雅黑" w:eastAsia="微软雅黑"/>
-          <w:b/>
-          <w:color w:val="333333"/>
-          <w:sz w:val="21"/>
+          <w:sz w:val="18"/>
         </w:rPr>
         <w:t>武汉工程科技学院</w:t>
       </w:r>
@@ -111,250 +190,236 @@
           <w:rFonts w:ascii="微软雅黑" w:hAnsi="微软雅黑" w:eastAsia="微软雅黑"/>
           <w:b w:val="0"/>
           <w:color w:val="333333"/>
-          <w:sz w:val="20"/>
+          <w:sz w:val="17"/>
         </w:rPr>
         <w:t xml:space="preserve">    电子信息工程    本科 · 2023-2027    大三在读</w:t>
       </w:r>
     </w:p>
     <w:p>
       <w:pPr>
-        <w:spacing w:before="200" w:after="0"/>
+        <w:spacing w:before="0" w:after="0" w:line="240" w:lineRule="auto"/>
+      </w:pPr>
+      <w:r>
+        <w:rPr>
+          <w:rFonts w:ascii="微软雅黑" w:hAnsi="微软雅黑" w:eastAsia="微软雅黑"/>
+          <w:b w:val="0"/>
+          <w:color w:val="888888"/>
+          <w:sz w:val="15"/>
+        </w:rPr>
+        <w:t>相关课程：C/C++程序设计、数据结构与算法、模/数电、信号与系统、嵌入式系统</w:t>
+      </w:r>
+    </w:p>
+    <w:p>
+      <w:pPr>
+        <w:spacing w:before="80" w:after="0" w:line="192" w:lineRule="auto"/>
       </w:pPr>
       <w:r>
         <w:rPr>
           <w:rFonts w:ascii="微软雅黑" w:hAnsi="微软雅黑" w:eastAsia="微软雅黑"/>
           <w:b/>
           <w:color w:val="2B527A"/>
-          <w:sz w:val="22"/>
+          <w:sz w:val="20"/>
         </w:rPr>
         <w:t>专业技能</w:t>
       </w:r>
     </w:p>
     <w:p>
       <w:pPr>
-        <w:spacing w:before="20" w:after="80" w:line="48" w:lineRule="auto"/>
+        <w:spacing w:before="0" w:after="0" w:line="240" w:lineRule="auto"/>
+        <w:ind w:left="170"/>
+      </w:pPr>
+      <w:r>
+        <w:rPr>
+          <w:rFonts w:ascii="微软雅黑" w:hAnsi="微软雅黑" w:eastAsia="微软雅黑"/>
+          <w:b w:val="0"/>
+          <w:color w:val="333333"/>
+          <w:sz w:val="17"/>
+        </w:rPr>
+        <w:t>• C/C++：精通 C，手写约 24,000 行认知引擎代码；掌握 C++ 面向对象设计</w:t>
+      </w:r>
+    </w:p>
+    <w:p>
+      <w:pPr>
+        <w:spacing w:before="0" w:after="0" w:line="240" w:lineRule="auto"/>
+        <w:ind w:left="170"/>
+      </w:pPr>
+      <w:r>
+        <w:rPr>
+          <w:rFonts w:ascii="微软雅黑" w:hAnsi="微软雅黑" w:eastAsia="微软雅黑"/>
+          <w:b w:val="0"/>
+          <w:color w:val="333333"/>
+          <w:sz w:val="17"/>
+        </w:rPr>
+        <w:t>• 嵌入式开发：STM32（F1/F4/H7）裸机 bare-metal，Keil/CubeMX，自研 FMC 协议栈</w:t>
+      </w:r>
+    </w:p>
+    <w:p>
+      <w:pPr>
+        <w:spacing w:before="0" w:after="0" w:line="240" w:lineRule="auto"/>
+        <w:ind w:left="170"/>
+      </w:pPr>
+      <w:r>
+        <w:rPr>
+          <w:rFonts w:ascii="微软雅黑" w:hAnsi="微软雅黑" w:eastAsia="微软雅黑"/>
+          <w:b w:val="0"/>
+          <w:color w:val="333333"/>
+          <w:sz w:val="17"/>
+        </w:rPr>
+        <w:t>• Linux：服务器运维、交叉编译（ARM/x86_64）、Shell/Makefile 构建、Git 全流程</w:t>
+      </w:r>
+    </w:p>
+    <w:p>
+      <w:pPr>
+        <w:spacing w:before="0" w:after="0" w:line="240" w:lineRule="auto"/>
+        <w:ind w:left="170"/>
+      </w:pPr>
+      <w:r>
+        <w:rPr>
+          <w:rFonts w:ascii="微软雅黑" w:hAnsi="微软雅黑" w:eastAsia="微软雅黑"/>
+          <w:b w:val="0"/>
+          <w:color w:val="333333"/>
+          <w:sz w:val="17"/>
+        </w:rPr>
+        <w:t>• 硬件与工具：原理图设计、PCB Layout、嘉立创 SMT 代工、示波器/逻辑分析仪/信号发生器</w:t>
+      </w:r>
+    </w:p>
+    <w:p>
+      <w:pPr>
+        <w:spacing w:before="80" w:after="0" w:line="192" w:lineRule="auto"/>
+      </w:pPr>
+      <w:r>
+        <w:rPr>
+          <w:rFonts w:ascii="微软雅黑" w:hAnsi="微软雅黑" w:eastAsia="微软雅黑"/>
+          <w:b/>
+          <w:color w:val="2B527A"/>
+          <w:sz w:val="20"/>
+        </w:rPr>
+        <w:t>项目经历</w:t>
+      </w:r>
+    </w:p>
+    <w:p>
+      <w:pPr>
+        <w:spacing w:before="60" w:after="0" w:line="240" w:lineRule="auto"/>
+      </w:pPr>
+      <w:r>
+        <w:rPr>
+          <w:rFonts w:ascii="微软雅黑" w:hAnsi="微软雅黑" w:eastAsia="微软雅黑"/>
+          <w:b/>
+          <w:color w:val="333333"/>
+          <w:sz w:val="18"/>
+        </w:rPr>
+        <w:t>玄枢 / PivotMind — 自主认知引擎（C）</w:t>
+      </w:r>
+      <w:r>
+        <w:rPr>
+          <w:rFonts w:ascii="微软雅黑" w:hAnsi="微软雅黑" w:eastAsia="微软雅黑"/>
+          <w:b w:val="0"/>
+          <w:color w:val="888888"/>
+          <w:sz w:val="15"/>
+        </w:rPr>
+        <w:t xml:space="preserve">   2025-2026</w:t>
+      </w:r>
+    </w:p>
+    <w:p>
+      <w:pPr>
+        <w:spacing w:before="0" w:after="0" w:line="240" w:lineRule="auto"/>
+        <w:ind w:left="170"/>
+      </w:pPr>
+      <w:r>
+        <w:rPr>
+          <w:rFonts w:ascii="微软雅黑" w:hAnsi="微软雅黑" w:eastAsia="微软雅黑"/>
+          <w:b w:val="0"/>
+          <w:color w:val="333333"/>
+          <w:sz w:val="17"/>
+        </w:rPr>
+        <w:t>• 纯 C 实现，零第三方依赖。全栈手写约 24,000 行 C 代码（47 个源文件），自研内存池分配器、图数据结构、JSON 解析器</w:t>
+      </w:r>
+    </w:p>
+    <w:p>
+      <w:pPr>
+        <w:spacing w:before="0" w:after="0" w:line="240" w:lineRule="auto"/>
+        <w:ind w:left="170"/>
+      </w:pPr>
+      <w:r>
+        <w:rPr>
+          <w:rFonts w:ascii="微软雅黑" w:hAnsi="微软雅黑" w:eastAsia="微软雅黑"/>
+          <w:b w:val="0"/>
+          <w:color w:val="333333"/>
+          <w:sz w:val="17"/>
+        </w:rPr>
+        <w:t>• 双机制学习：自主学习（衰减率 0.999，置信度竞争传播）+ 外部反馈纠偏，模拟生物神经元的自主与非自主调节</w:t>
+      </w:r>
+    </w:p>
+    <w:p>
+      <w:pPr>
+        <w:spacing w:before="0" w:after="0" w:line="240" w:lineRule="auto"/>
+        <w:ind w:left="170"/>
+      </w:pPr>
+      <w:r>
+        <w:rPr>
+          <w:rFonts w:ascii="微软雅黑" w:hAnsi="微软雅黑" w:eastAsia="微软雅黑"/>
+          <w:b w:val="0"/>
+          <w:color w:val="333333"/>
+          <w:sz w:val="17"/>
+        </w:rPr>
+        <w:t>• 全量训练：50 轮 308 万次迭代，构建 5,100+ 词汇节点、125 万+ 语义边，平均置信度 0.446，高频字节点收敛稳定</w:t>
+      </w:r>
+    </w:p>
+    <w:p>
+      <w:pPr>
+        <w:spacing w:before="0" w:after="0" w:line="240" w:lineRule="auto"/>
+        <w:ind w:left="170"/>
+      </w:pPr>
+      <w:r>
+        <w:rPr>
+          <w:rFonts w:ascii="微软雅黑" w:hAnsi="微软雅黑" w:eastAsia="微软雅黑"/>
+          <w:b w:val="0"/>
+          <w:color w:val="333333"/>
+          <w:sz w:val="17"/>
+        </w:rPr>
+        <w:t>• 拓扑级并行推理引擎：每活跃子拓扑分配独立线程，自动适配 CPU 核数，新拓扑可自动接入线程池</w:t>
+      </w:r>
+    </w:p>
+    <w:p>
+      <w:pPr>
+        <w:spacing w:before="0" w:after="0" w:line="240" w:lineRule="auto"/>
+        <w:ind w:left="170"/>
+      </w:pPr>
+      <w:r>
+        <w:rPr>
+          <w:rFonts w:ascii="微软雅黑" w:hAnsi="微软雅黑" w:eastAsia="微软雅黑"/>
+          <w:b w:val="0"/>
+          <w:color w:val="333333"/>
+          <w:sz w:val="17"/>
+        </w:rPr>
+        <w:t>• 双架构 CI/CD（x86_64 OpenMP + ARM 纯标量），树莓派 Zero 2W（1GHz 单核）可流畅运行推理</w:t>
+      </w:r>
+    </w:p>
+    <w:p>
+      <w:pPr>
+        <w:spacing w:before="0" w:after="0" w:line="240" w:lineRule="auto"/>
+        <w:ind w:left="170"/>
       </w:pPr>
       <w:r>
         <w:rPr>
           <w:rFonts w:ascii="微软雅黑" w:hAnsi="微软雅黑" w:eastAsia="微软雅黑"/>
           <w:b w:val="0"/>
           <w:color w:val="2B527A"/>
-          <w:sz w:val="10"/>
+          <w:sz w:val="14"/>
         </w:rPr>
-        <w:t>──────────────────────────────────────────────────</w:t>
+        <w:t>github.com/afd-ll/PivotMind</w:t>
       </w:r>
     </w:p>
     <w:p>
       <w:pPr>
-        <w:spacing w:before="20" w:after="20" w:line="276" w:lineRule="auto"/>
-        <w:ind w:left="227"/>
-      </w:pPr>
-      <w:r>
-        <w:rPr>
-          <w:rFonts w:ascii="微软雅黑" w:hAnsi="微软雅黑" w:eastAsia="微软雅黑"/>
-          <w:b w:val="0"/>
-          <w:color w:val="333333"/>
-          <w:sz w:val="20"/>
-        </w:rPr>
-        <w:t>• 精通 C 语言，纯手写约 24,000 行 C 代码的认知引擎项目（玄枢/PivotMind）</w:t>
-      </w:r>
-    </w:p>
-    <w:p>
-      <w:pPr>
-        <w:spacing w:before="20" w:after="20" w:line="276" w:lineRule="auto"/>
-        <w:ind w:left="227"/>
-      </w:pPr>
-      <w:r>
-        <w:rPr>
-          <w:rFonts w:ascii="微软雅黑" w:hAnsi="微软雅黑" w:eastAsia="微软雅黑"/>
-          <w:b w:val="0"/>
-          <w:color w:val="333333"/>
-          <w:sz w:val="20"/>
-        </w:rPr>
-        <w:t>• 嵌入式开发：STM32（F1/F4/H7 系列）裸机 bare-metal，Keil/CubeMX 工具链，自研 FMC 协议栈</w:t>
-      </w:r>
-    </w:p>
-    <w:p>
-      <w:pPr>
-        <w:spacing w:before="20" w:after="20" w:line="276" w:lineRule="auto"/>
-        <w:ind w:left="227"/>
-      </w:pPr>
-      <w:r>
-        <w:rPr>
-          <w:rFonts w:ascii="微软雅黑" w:hAnsi="微软雅黑" w:eastAsia="微软雅黑"/>
-          <w:b w:val="0"/>
-          <w:color w:val="333333"/>
-          <w:sz w:val="20"/>
-        </w:rPr>
-        <w:t>• Linux 运维：服务器管理、交叉编译、Shell 脚本、Git 版本控制、Tailscale 组网</w:t>
-      </w:r>
-    </w:p>
-    <w:p>
-      <w:pPr>
-        <w:spacing w:before="20" w:after="20" w:line="276" w:lineRule="auto"/>
-        <w:ind w:left="227"/>
-      </w:pPr>
-      <w:r>
-        <w:rPr>
-          <w:rFonts w:ascii="微软雅黑" w:hAnsi="微软雅黑" w:eastAsia="微软雅黑"/>
-          <w:b w:val="0"/>
-          <w:color w:val="333333"/>
-          <w:sz w:val="20"/>
-        </w:rPr>
-        <w:t>• Python：数据采集、自动化脚本、原型开发与测试</w:t>
-      </w:r>
-    </w:p>
-    <w:p>
-      <w:pPr>
-        <w:spacing w:before="20" w:after="20" w:line="276" w:lineRule="auto"/>
-        <w:ind w:left="227"/>
-      </w:pPr>
-      <w:r>
-        <w:rPr>
-          <w:rFonts w:ascii="微软雅黑" w:hAnsi="微软雅黑" w:eastAsia="微软雅黑"/>
-          <w:b w:val="0"/>
-          <w:color w:val="333333"/>
-          <w:sz w:val="20"/>
-        </w:rPr>
-        <w:t>• 电路设计：原理图设计、PCB Layout、嘉立创 SMT 代工全流程</w:t>
-      </w:r>
-    </w:p>
-    <w:p>
-      <w:pPr>
-        <w:spacing w:before="200" w:after="0"/>
-      </w:pPr>
-      <w:r>
-        <w:rPr>
-          <w:rFonts w:ascii="微软雅黑" w:hAnsi="微软雅黑" w:eastAsia="微软雅黑"/>
-          <w:b/>
-          <w:color w:val="2B527A"/>
-          <w:sz w:val="22"/>
-        </w:rPr>
-        <w:t>项目经历</w:t>
-      </w:r>
-    </w:p>
-    <w:p>
-      <w:pPr>
-        <w:spacing w:before="20" w:after="80" w:line="48" w:lineRule="auto"/>
-      </w:pPr>
-      <w:r>
-        <w:rPr>
-          <w:rFonts w:ascii="微软雅黑" w:hAnsi="微软雅黑" w:eastAsia="微软雅黑"/>
-          <w:b w:val="0"/>
-          <w:color w:val="2B527A"/>
-          <w:sz w:val="10"/>
-        </w:rPr>
-        <w:t>──────────────────────────────────────────────────</w:t>
-      </w:r>
-    </w:p>
-    <w:p>
-      <w:pPr>
-        <w:spacing w:before="120" w:after="0"/>
+        <w:spacing w:before="60" w:after="0" w:line="240" w:lineRule="auto"/>
       </w:pPr>
       <w:r>
         <w:rPr>
           <w:rFonts w:ascii="微软雅黑" w:hAnsi="微软雅黑" w:eastAsia="微软雅黑"/>
           <w:b/>
           <w:color w:val="333333"/>
-          <w:sz w:val="21"/>
-        </w:rPr>
-        <w:t>玄枢 / PivotMind — 自主认知引擎</w:t>
-      </w:r>
-      <w:r>
-        <w:rPr>
-          <w:rFonts w:ascii="微软雅黑" w:hAnsi="微软雅黑" w:eastAsia="微软雅黑"/>
-          <w:b w:val="0"/>
-          <w:color w:val="888888"/>
           <w:sz w:val="18"/>
-        </w:rPr>
-        <w:t xml:space="preserve">    2025-2026</w:t>
-      </w:r>
-    </w:p>
-    <w:p>
-      <w:pPr>
-        <w:spacing w:before="0" w:after="40"/>
-        <w:ind w:left="227"/>
-      </w:pPr>
-      <w:r>
-        <w:rPr>
-          <w:rFonts w:ascii="微软雅黑" w:hAnsi="微软雅黑" w:eastAsia="微软雅黑"/>
-          <w:b w:val="0"/>
-          <w:color w:val="666666"/>
-          <w:sz w:val="18"/>
-        </w:rPr>
-        <w:t>基于多拓扑网络的认知 AI 框架，纯 C 实现，零第三方依赖。</w:t>
-      </w:r>
-    </w:p>
-    <w:p>
-      <w:pPr>
-        <w:spacing w:before="20" w:after="20" w:line="276" w:lineRule="auto"/>
-        <w:ind w:left="227"/>
-      </w:pPr>
-      <w:r>
-        <w:rPr>
-          <w:rFonts w:ascii="微软雅黑" w:hAnsi="微软雅黑" w:eastAsia="微软雅黑"/>
-          <w:b w:val="0"/>
-          <w:color w:val="333333"/>
-          <w:sz w:val="19"/>
-        </w:rPr>
-        <w:t>• 全栈手写约 24,000 行 C 代码，含自研内存池、图数据结构、JSON 解析器</w:t>
-      </w:r>
-    </w:p>
-    <w:p>
-      <w:pPr>
-        <w:spacing w:before="20" w:after="20" w:line="276" w:lineRule="auto"/>
-        <w:ind w:left="227"/>
-      </w:pPr>
-      <w:r>
-        <w:rPr>
-          <w:rFonts w:ascii="微软雅黑" w:hAnsi="微软雅黑" w:eastAsia="微软雅黑"/>
-          <w:b w:val="0"/>
-          <w:color w:val="333333"/>
-          <w:sz w:val="19"/>
-        </w:rPr>
-        <w:t>• 全量训练流水线：50 轮迭代构建 5,100+ 词汇节点、125 万+ 语义边</w:t>
-      </w:r>
-    </w:p>
-    <w:p>
-      <w:pPr>
-        <w:spacing w:before="20" w:after="20" w:line="276" w:lineRule="auto"/>
-        <w:ind w:left="227"/>
-      </w:pPr>
-      <w:r>
-        <w:rPr>
-          <w:rFonts w:ascii="微软雅黑" w:hAnsi="微软雅黑" w:eastAsia="微软雅黑"/>
-          <w:b w:val="0"/>
-          <w:color w:val="333333"/>
-          <w:sz w:val="19"/>
-        </w:rPr>
-        <w:t>• 双架构 CI/CD：x86_64（OpenMP 并行加速）+ ARM（纯标量），树莓派 Zero 2W 可运行</w:t>
-      </w:r>
-    </w:p>
-    <w:p>
-      <w:pPr>
-        <w:spacing w:before="0" w:after="40"/>
-        <w:ind w:left="227"/>
-      </w:pPr>
-      <w:r>
-        <w:rPr>
-          <w:rFonts w:ascii="微软雅黑" w:hAnsi="微软雅黑" w:eastAsia="微软雅黑"/>
-          <w:b w:val="0"/>
-          <w:color w:val="2B527A"/>
-          <w:sz w:val="17"/>
-        </w:rPr>
-        <w:t>🔗 github.com/afd-ll/PivotMind</w:t>
-      </w:r>
-    </w:p>
-    <w:p>
-      <w:pPr>
-        <w:spacing w:before="120" w:after="0"/>
-      </w:pPr>
-      <w:r>
-        <w:rPr>
-          <w:rFonts w:ascii="微软雅黑" w:hAnsi="微软雅黑" w:eastAsia="微软雅黑"/>
-          <w:b/>
-          <w:color w:val="333333"/>
-          <w:sz w:val="21"/>
         </w:rPr>
         <w:t>STM32 分布式集群计算机</w:t>
       </w:r>
@@ -363,273 +428,230 @@
           <w:rFonts w:ascii="微软雅黑" w:hAnsi="微软雅黑" w:eastAsia="微软雅黑"/>
           <w:b w:val="0"/>
           <w:color w:val="888888"/>
-          <w:sz w:val="18"/>
+          <w:sz w:val="15"/>
         </w:rPr>
-        <w:t xml:space="preserve">    2026（毕业设计）</w:t>
+        <w:t xml:space="preserve">   2026（毕业设计）</w:t>
       </w:r>
     </w:p>
     <w:p>
       <w:pPr>
-        <w:spacing w:before="0" w:after="40"/>
-        <w:ind w:left="227"/>
-      </w:pPr>
-      <w:r>
-        <w:rPr>
-          <w:rFonts w:ascii="微软雅黑" w:hAnsi="微软雅黑" w:eastAsia="微软雅黑"/>
-          <w:b w:val="0"/>
-          <w:color w:val="666666"/>
-          <w:sz w:val="18"/>
-        </w:rPr>
-        <w:t>STM32H750 + 多片 H745 的 P2P 分布计算系统，网状拓扑，自研通信协议栈。</w:t>
-      </w:r>
-    </w:p>
-    <w:p>
-      <w:pPr>
-        <w:spacing w:before="20" w:after="20" w:line="276" w:lineRule="auto"/>
-        <w:ind w:left="227"/>
+        <w:spacing w:before="0" w:after="0" w:line="240" w:lineRule="auto"/>
+        <w:ind w:left="170"/>
       </w:pPr>
       <w:r>
         <w:rPr>
           <w:rFonts w:ascii="微软雅黑" w:hAnsi="微软雅黑" w:eastAsia="微软雅黑"/>
           <w:b w:val="0"/>
           <w:color w:val="333333"/>
-          <w:sz w:val="19"/>
+          <w:sz w:val="17"/>
         </w:rPr>
-        <w:t>• 自研 FMC 协议栈 + 轻量节点间通信协议，每节点 SD 卡独立存储</w:t>
+        <w:t>• 主控 H750 + 多片 H745，网状拓扑 P2P 分布计算系统；自研 FMC 总线协议，支持广播/单播/多播</w:t>
       </w:r>
     </w:p>
     <w:p>
       <w:pPr>
-        <w:spacing w:before="20" w:after="20" w:line="276" w:lineRule="auto"/>
-        <w:ind w:left="227"/>
+        <w:spacing w:before="0" w:after="0" w:line="240" w:lineRule="auto"/>
+        <w:ind w:left="170"/>
       </w:pPr>
       <w:r>
         <w:rPr>
           <w:rFonts w:ascii="微软雅黑" w:hAnsi="微软雅黑" w:eastAsia="微软雅黑"/>
           <w:b w:val="0"/>
           <w:color w:val="333333"/>
-          <w:sz w:val="19"/>
+          <w:sz w:val="17"/>
         </w:rPr>
-        <w:t>• 裸机 bare-metal 开发，统筹多核内存布局与分布式同步机制</w:t>
+        <w:t>• 裸机开发：统筹多核 Flash/SRAM 内存布局、中断优先级分配与硬件信号量同步机制</w:t>
       </w:r>
     </w:p>
     <w:p>
       <w:pPr>
-        <w:spacing w:before="20" w:after="20" w:line="276" w:lineRule="auto"/>
-        <w:ind w:left="227"/>
+        <w:spacing w:before="0" w:after="0" w:line="240" w:lineRule="auto"/>
+        <w:ind w:left="170"/>
       </w:pPr>
       <w:r>
         <w:rPr>
           <w:rFonts w:ascii="微软雅黑" w:hAnsi="微软雅黑" w:eastAsia="微软雅黑"/>
           <w:b w:val="0"/>
           <w:color w:val="333333"/>
-          <w:sz w:val="19"/>
+          <w:sz w:val="17"/>
         </w:rPr>
-        <w:t>• 冗余通信架构设计，面向集群场景预留扩展接口</w:t>
+        <w:t>• 每节点 SD 卡独立存储；通信预留双通道热备，节点支持动态增减，架构级冗余设计</w:t>
       </w:r>
     </w:p>
     <w:p>
       <w:pPr>
-        <w:spacing w:before="120" w:after="0"/>
+        <w:spacing w:before="60" w:after="0" w:line="240" w:lineRule="auto"/>
       </w:pPr>
       <w:r>
         <w:rPr>
           <w:rFonts w:ascii="微软雅黑" w:hAnsi="微软雅黑" w:eastAsia="微软雅黑"/>
           <w:b/>
           <w:color w:val="333333"/>
-          <w:sz w:val="21"/>
+          <w:sz w:val="18"/>
         </w:rPr>
-        <w:t>STM32 简易仪器仪表</w:t>
+        <w:t>STM32 简易仪器仪表（硬创社开源）</w:t>
       </w:r>
       <w:r>
         <w:rPr>
           <w:rFonts w:ascii="微软雅黑" w:hAnsi="微软雅黑" w:eastAsia="微软雅黑"/>
           <w:b w:val="0"/>
           <w:color w:val="888888"/>
-          <w:sz w:val="18"/>
+          <w:sz w:val="15"/>
         </w:rPr>
-        <w:t xml:space="preserve">    2026</w:t>
+        <w:t xml:space="preserve">   2026</w:t>
       </w:r>
     </w:p>
     <w:p>
       <w:pPr>
-        <w:spacing w:before="0" w:after="40"/>
-        <w:ind w:left="227"/>
-      </w:pPr>
-      <w:r>
-        <w:rPr>
-          <w:rFonts w:ascii="微软雅黑" w:hAnsi="微软雅黑" w:eastAsia="微软雅黑"/>
-          <w:b w:val="0"/>
-          <w:color w:val="666666"/>
-          <w:sz w:val="18"/>
-        </w:rPr>
-        <w:t>嘉立创硬创社开源项目。STM32F103RCT6 主控，信号采集与多方式信号调理。</w:t>
-      </w:r>
-    </w:p>
-    <w:p>
-      <w:pPr>
-        <w:spacing w:before="20" w:after="20" w:line="276" w:lineRule="auto"/>
-        <w:ind w:left="227"/>
+        <w:spacing w:before="0" w:after="0" w:line="240" w:lineRule="auto"/>
+        <w:ind w:left="170"/>
       </w:pPr>
       <w:r>
         <w:rPr>
           <w:rFonts w:ascii="微软雅黑" w:hAnsi="微软雅黑" w:eastAsia="微软雅黑"/>
           <w:b w:val="0"/>
           <w:color w:val="333333"/>
-          <w:sz w:val="19"/>
+          <w:sz w:val="17"/>
         </w:rPr>
-        <w:t>• 原理图设计 + PCB Layout + 嘉立创 SMT 代工全流程</w:t>
+        <w:t>• F103RCT6 主控嵌入式测量仪器：过零比较 + 电阻分压双模式信号调理，自动切换量程</w:t>
       </w:r>
     </w:p>
     <w:p>
       <w:pPr>
-        <w:spacing w:before="20" w:after="20" w:line="276" w:lineRule="auto"/>
-        <w:ind w:left="227"/>
+        <w:spacing w:before="0" w:after="0" w:line="240" w:lineRule="auto"/>
+        <w:ind w:left="170"/>
       </w:pPr>
       <w:r>
         <w:rPr>
           <w:rFonts w:ascii="微软雅黑" w:hAnsi="微软雅黑" w:eastAsia="微软雅黑"/>
           <w:b w:val="0"/>
           <w:color w:val="333333"/>
-          <w:sz w:val="19"/>
+          <w:sz w:val="17"/>
         </w:rPr>
-        <w:t>• 过零比较器与电阻分压双模式信号调理方案</w:t>
+        <w:t>• 需求分析→方案→原理图/PCB（立创EDA）→嘉立创 SMT 代工→调试验证，全流程独立负责</w:t>
       </w:r>
     </w:p>
     <w:p>
       <w:pPr>
-        <w:spacing w:before="200" w:after="0"/>
+        <w:spacing w:before="80" w:after="0" w:line="192" w:lineRule="auto"/>
       </w:pPr>
       <w:r>
         <w:rPr>
           <w:rFonts w:ascii="微软雅黑" w:hAnsi="微软雅黑" w:eastAsia="微软雅黑"/>
           <w:b/>
           <w:color w:val="2B527A"/>
-          <w:sz w:val="22"/>
+          <w:sz w:val="20"/>
         </w:rPr>
         <w:t>竞赛与荣誉</w:t>
       </w:r>
     </w:p>
     <w:p>
       <w:pPr>
-        <w:spacing w:before="20" w:after="80" w:line="48" w:lineRule="auto"/>
-      </w:pPr>
-      <w:r>
-        <w:rPr>
-          <w:rFonts w:ascii="微软雅黑" w:hAnsi="微软雅黑" w:eastAsia="微软雅黑"/>
-          <w:b w:val="0"/>
-          <w:color w:val="2B527A"/>
-          <w:sz w:val="10"/>
-        </w:rPr>
-        <w:t>──────────────────────────────────────────────────</w:t>
-      </w:r>
-    </w:p>
-    <w:p>
-      <w:pPr>
-        <w:spacing w:before="20" w:after="20" w:line="276" w:lineRule="auto"/>
-        <w:ind w:left="227"/>
+        <w:spacing w:before="0" w:after="0" w:line="240" w:lineRule="auto"/>
+        <w:ind w:left="170"/>
       </w:pPr>
       <w:r>
         <w:rPr>
           <w:rFonts w:ascii="微软雅黑" w:hAnsi="微软雅黑" w:eastAsia="微软雅黑"/>
           <w:b w:val="0"/>
           <w:color w:val="333333"/>
-          <w:sz w:val="20"/>
+          <w:sz w:val="17"/>
         </w:rPr>
-        <w:t>• 全国大学生电子设计大赛 — 获奖（2025，C题：基于单目视觉的目标物测量装置）</w:t>
+        <w:t>• 全国大学生电子设计大赛（2025，C 题）：OV2640 + STM32 单目视觉目标物测量装置，获奖</w:t>
       </w:r>
     </w:p>
     <w:p>
       <w:pPr>
-        <w:spacing w:before="20" w:after="20" w:line="276" w:lineRule="auto"/>
-        <w:ind w:left="227"/>
+        <w:spacing w:before="0" w:after="0" w:line="240" w:lineRule="auto"/>
+        <w:ind w:left="170"/>
       </w:pPr>
       <w:r>
         <w:rPr>
           <w:rFonts w:ascii="微软雅黑" w:hAnsi="微软雅黑" w:eastAsia="微软雅黑"/>
           <w:b w:val="0"/>
           <w:color w:val="333333"/>
-          <w:sz w:val="20"/>
+          <w:sz w:val="17"/>
+        </w:rPr>
+        <w:t>• 方案：A4 纸黑边框参考物 + 相似三角形测距；在 MCU 端实现单目视觉算法，理解硬件外设选型的关键性</w:t>
+      </w:r>
+    </w:p>
+    <w:p>
+      <w:pPr>
+        <w:spacing w:before="0" w:after="0" w:line="240" w:lineRule="auto"/>
+        <w:ind w:left="170"/>
+      </w:pPr>
+      <w:r>
+        <w:rPr>
+          <w:rFonts w:ascii="微软雅黑" w:hAnsi="微软雅黑" w:eastAsia="微软雅黑"/>
+          <w:b w:val="0"/>
+          <w:color w:val="333333"/>
+          <w:sz w:val="17"/>
         </w:rPr>
         <w:t>• 挑战杯 / 创新杯 — 校级提名</w:t>
       </w:r>
     </w:p>
     <w:p>
       <w:pPr>
-        <w:spacing w:before="200" w:after="0"/>
+        <w:spacing w:before="80" w:after="0" w:line="192" w:lineRule="auto"/>
       </w:pPr>
       <w:r>
         <w:rPr>
           <w:rFonts w:ascii="微软雅黑" w:hAnsi="微软雅黑" w:eastAsia="微软雅黑"/>
           <w:b/>
           <w:color w:val="2B527A"/>
-          <w:sz w:val="22"/>
+          <w:sz w:val="20"/>
         </w:rPr>
         <w:t>校园经历</w:t>
       </w:r>
     </w:p>
     <w:p>
       <w:pPr>
-        <w:spacing w:before="20" w:after="80" w:line="48" w:lineRule="auto"/>
-      </w:pPr>
-      <w:r>
-        <w:rPr>
-          <w:rFonts w:ascii="微软雅黑" w:hAnsi="微软雅黑" w:eastAsia="微软雅黑"/>
-          <w:b w:val="0"/>
-          <w:color w:val="2B527A"/>
-          <w:sz w:val="10"/>
-        </w:rPr>
-        <w:t>──────────────────────────────────────────────────</w:t>
-      </w:r>
-    </w:p>
-    <w:p>
-      <w:pPr>
-        <w:spacing w:before="20" w:after="20" w:line="276" w:lineRule="auto"/>
-        <w:ind w:left="227"/>
+        <w:spacing w:before="0" w:after="0" w:line="240" w:lineRule="auto"/>
+        <w:ind w:left="170"/>
       </w:pPr>
       <w:r>
         <w:rPr>
           <w:rFonts w:ascii="微软雅黑" w:hAnsi="微软雅黑" w:eastAsia="微软雅黑"/>
           <w:b w:val="0"/>
           <w:color w:val="333333"/>
-          <w:sz w:val="20"/>
+          <w:sz w:val="17"/>
         </w:rPr>
-        <w:t>• 班级学习委员 — 统筹班内学风建设，协调教务沟通</w:t>
+        <w:t>• 班级学习委员（连续两年）— 学风建设、教务协调、考前组织，获评优秀班干部</w:t>
       </w:r>
     </w:p>
     <w:p>
       <w:pPr>
-        <w:spacing w:before="20" w:after="20" w:line="276" w:lineRule="auto"/>
-        <w:ind w:left="227"/>
+        <w:spacing w:before="0" w:after="0" w:line="240" w:lineRule="auto"/>
+        <w:ind w:left="170"/>
       </w:pPr>
       <w:r>
         <w:rPr>
           <w:rFonts w:ascii="微软雅黑" w:hAnsi="微软雅黑" w:eastAsia="微软雅黑"/>
           <w:b w:val="0"/>
           <w:color w:val="333333"/>
-          <w:sz w:val="20"/>
+          <w:sz w:val="17"/>
         </w:rPr>
-        <w:t>• 校级社团联合会办公室 — 活动策划与组织协调</w:t>
+        <w:t>• 校社团联合会办公室 — 活动审批与备案、大型活动场地协调与流程监管</w:t>
       </w:r>
     </w:p>
     <w:p>
       <w:pPr>
-        <w:spacing w:before="20" w:after="20" w:line="276" w:lineRule="auto"/>
-        <w:ind w:left="227"/>
+        <w:spacing w:before="0" w:after="0" w:line="240" w:lineRule="auto"/>
+        <w:ind w:left="170"/>
       </w:pPr>
       <w:r>
         <w:rPr>
           <w:rFonts w:ascii="微软雅黑" w:hAnsi="微软雅黑" w:eastAsia="微软雅黑"/>
           <w:b w:val="0"/>
           <w:color w:val="333333"/>
-          <w:sz w:val="20"/>
+          <w:sz w:val="17"/>
         </w:rPr>
-        <w:t>• 院级学风督导小组办公室负责人 — 学风检查与督导管理</w:t>
+        <w:t>• 院学风督导小组负责人 — 学风检查制度制定、查课数据汇总与协调</w:t>
       </w:r>
     </w:p>
     <w:sectPr>
       <w:pgSz w:w="12240" w:h="15840"/>
-      <w:pgMar w:top="1020" w:right="1247" w:bottom="850" w:left="1247" w:header="720" w:footer="720" w:gutter="0"/>
+      <w:pgMar w:top="680" w:right="1020" w:bottom="567" w:left="1020" w:header="720" w:footer="720" w:gutter="0"/>
       <w:cols w:space="720"/>
       <w:docGrid w:linePitch="360"/>
     </w:sectPr>

</xml_diff>